<commit_message>
Add МЕУ technical-spec compliance verification as pre-procurement gate
Incorporate the budget-project-control/verification-compliance-technical-
specifications step: technical specification of the ISS⇄FVMS integration
must pass МЕУ compliance verification before procurement/contract.

https://claude.ai/code/session_01Q74gPyp6529zVVwBUZsh4d
</commit_message>
<xml_diff>
--- a/docs/stanovishte-IARA-ISS-FVMS-integraciya.docx
+++ b/docs/stanovishte-IARA-ISS-FVMS-integraciya.docx
@@ -443,6 +443,11 @@
         <w:t>Връзката към портала на Министерството на електронното управление (МЕУ) — budget-project-control — сочи към механизма за съгласуване и бюджетен контрол на ИКТ проектите на администрациите. Това е формалната процедура, през която такова обединяване трябва да премине, за да е законосъобразно.</w:t>
       </w:r>
     </w:p>
+    <w:p>
+      <w:r>
+        <w:t>В рамките на този контрол съществува отделна, задължителна стъпка — услугата „Проверка за съответствие на техническата спецификация". Преди администрацията да обяви обществена поръчка или да сключи договор за ИКТ дейност, тя внася техническата спецификация в МЕУ за проверка дали отговаря на изискванията за оперативна съвместимост, информационна сигурност, архитектура, преизползване на общите компоненти (eID, ССЕВ, RegiX, pay.egov.bg, Държавен облак) и недопускане на дублиране на функционалност. За обединяването ИСС ⇄ FVMS това е gate преди поръчка/договор — именно тук се проверяват най-рисковите точки (дублиране между проекти 0026 и 0007, оперативна съвместимост, сигурност и хостинг на данните на Wialon).</w:t>
+      </w:r>
+    </w:p>
     <w:tbl>
       <w:tblPr>
         <w:tblStyle w:val="LightGrid-Accent1"/>
@@ -523,6 +528,38 @@
           <w:p>
             <w:r>
               <w:t>Нов ИКТ проект → задължително внасяне за съгласуване в МЕУ преди разход</w:t>
+            </w:r>
+          </w:p>
+        </w:tc>
+      </w:tr>
+      <w:tr>
+        <w:tc>
+          <w:tcPr>
+            <w:tcW w:type="dxa" w:w="2880"/>
+          </w:tcPr>
+          <w:p>
+            <w:r>
+              <w:t>Проверка за съответствие на техническата спецификация</w:t>
+            </w:r>
+          </w:p>
+        </w:tc>
+        <w:tc>
+          <w:tcPr>
+            <w:tcW w:type="dxa" w:w="2880"/>
+          </w:tcPr>
+          <w:p>
+            <w:r>
+              <w:t>МЕУ услуга verification-compliance-technical-specifications</w:t>
+            </w:r>
+          </w:p>
+        </w:tc>
+        <w:tc>
+          <w:tcPr>
+            <w:tcW w:type="dxa" w:w="2880"/>
+          </w:tcPr>
+          <w:p>
+            <w:r>
+              <w:t>Техническата спецификация на интеграцията (API ИСС ⇄ FVMS) се внася за проверка преди обявяване на обществена поръчка/сключване на договор</w:t>
             </w:r>
           </w:p>
         </w:tc>
@@ -848,8 +885,9 @@
         </w:rPr>
         <w:t xml:space="preserve">Порталът budget-project-control </w:t>
       </w:r>
+      <w:r/>
       <w:r>
-        <w:t>е формалната врата, през която обединяването става законосъобразно.</w:t>
+        <w:t>е формалната врата, през която обединяването става законосъобразно, а проверката за съответствие на техническата спецификация е конкретната задължителна стъпка преди обявяване на поръчка/сключване на договор.</w:t>
       </w:r>
     </w:p>
     <w:p>

</xml_diff>

<commit_message>
Incorporate МЕУ ПП/ТС templates: open-source requirement & COTS model
Add section 6 grounding the analysis in the official МЕУ methodology:
- ТС template (Приложение №1 към чл. 38, ал. 3), compliance certification
  under чл. 58б ЗЕУ, projects register & review rules
- estimated-value argumentation rules (4-6mo platform vs >=6mo custom; 15%
  maintenance; готов софтуер vs custom decision tree)
- НОИИСРЕАУ source-code ownership / open-source licensing / public repo
- key conclusion: Wialon Local (closed COTS) cannot become owned OSS, so the
  compliant model is licensed COTS component + own open-source integration layer

https://claude.ai/code/session_01Q74gPyp6529zVVwBUZsh4d
</commit_message>
<xml_diff>
--- a/docs/stanovishte-IARA-ISS-FVMS-integraciya.docx
+++ b/docs/stanovishte-IARA-ISS-FVMS-integraciya.docx
@@ -361,28 +361,7 @@
         <w:t xml:space="preserve">Ключово наблюдение: </w:t>
       </w:r>
       <w:r>
-        <w:t>документи 1–3 представляват една и съща интегрирана екосистема, разработена в рамките на един проект (0026). ИСС е централната система с модули „Административни услуги", „Риболовни кораби", „Риболовен капацитет", „Аквакултурни стопанства", „Квоти за улов", „Стопански/Любителски риболов", „Контролна дейност", „Научен риболов" и „Администрация" (включваща номенклатурите „Инспектори" и „Патрулни средства"). Двете мобилни приложения са нейни канали за достъп:</w:t>
-      </w:r>
-    </w:p>
-    <w:p>
-      <w:pPr>
-        <w:pStyle w:val="ListBullet"/>
-      </w:pPr>
-      <w:r>
-        <w:t>гражданското приложение подава билети за любителски риболов, отчети за улов и сигнали за нарушения → постъпват в ИСС;</w:t>
-      </w:r>
-    </w:p>
-    <w:p>
-      <w:pPr>
-        <w:pStyle w:val="ListBullet"/>
-      </w:pPr>
-      <w:r>
-        <w:t>инспекторското приложение записва инспекции (включително офлайн) → захранват модул „Контролна дейност" в ИСС.</w:t>
-      </w:r>
-    </w:p>
-    <w:p>
-      <w:r>
-        <w:t>Документ 4 (СНРК 2.0 / FVMS) е отделен продукт от друг проект (0007), на друг изпълнител (Скортел ООД), базиран на готовата търговска платформа Wialon Local (CMS Manager, обекти под наблюдение, датчици, геозони, права за достъп / ACL).</w:t>
+        <w:t>документи 1–3 са една и съща интегрирана екосистема (проект 0026): ИСС е централната система (модули „Административни услуги", „Контролна дейност", „Администрация" с номенклатури „Инспектори" и „Патрулни средства" и др.), а двете мобилни приложения са нейни канали за достъп. Документ 4 (СНРК 2.0 / FVMS) е отделен продукт от друг проект (0007), на друг изпълнител (Скортел ООД), базиран на готовата търговска платформа Wialon Local.</w:t>
       </w:r>
     </w:p>
     <w:p>
@@ -403,7 +382,7 @@
     </w:p>
     <w:p>
       <w:r>
-        <w:t>Тук няма реален предмет на „обединяване" — ИСС и двете мобилни приложения споделят потребители, номенклатури и бизнес процеси и са проектирани да работят заедно.</w:t>
+        <w:t>ИСС и двете мобилни приложения споделят потребители, номенклатури и бизнес процеси и са проектирани да работят заедно.</w:t>
       </w:r>
     </w:p>
     <w:p>
@@ -416,7 +395,7 @@
     </w:p>
     <w:p>
       <w:r>
-        <w:t>Съществува естествена точка на интеграция: ИСС и инспекторското приложение оперират с обектите „инспектори" и „патрулни средства", а FVMS/Wialon разполага с тяхното реално местоположение и телеметрия.</w:t>
+        <w:t>Естествена точка на интеграция: ИСС/инспекторското приложение оперират с „инспектори" и „патрулни средства", а FVMS/Wialon знае реалното им местоположение и телеметрия.</w:t>
       </w:r>
     </w:p>
     <w:p>
@@ -427,7 +406,7 @@
         <w:t xml:space="preserve">Препоръчителен модел: интеграция през интерфейс (API), а не сливане на кодовите бази. </w:t>
       </w:r>
       <w:r>
-        <w:t>FVMS/Wialon подава позиции и телеметрия → ИСС ги съхранява/визуализира към съответната инспекция и патрулно средство. Така всеки продукт остава самостоятелен компонент, а данните се обменят по стандартизиран начин.</w:t>
+        <w:t>FVMS/Wialon подава позиции и телеметрия → ИСС ги съхранява/визуализира към съответната инспекция и патрулно средство.</w:t>
       </w:r>
     </w:p>
     <w:p>
@@ -440,12 +419,12 @@
     </w:p>
     <w:p>
       <w:r>
-        <w:t>Връзката към портала на Министерството на електронното управление (МЕУ) — budget-project-control — сочи към механизма за съгласуване и бюджетен контрол на ИКТ проектите на администрациите. Това е формалната процедура, през която такова обединяване трябва да премине, за да е законосъобразно.</w:t>
+        <w:t>Връзката към портала на Министерството на електронното управление (МЕУ) — budget-project-control — сочи към механизма за съгласуване и бюджетен контрол на ИКТ проектите на администрациите.</w:t>
       </w:r>
     </w:p>
     <w:p>
       <w:r>
-        <w:t>В рамките на този контрол съществува отделна, задължителна стъпка — услугата „Проверка за съответствие на техническата спецификация". Преди администрацията да обяви обществена поръчка или да сключи договор за ИКТ дейност, тя внася техническата спецификация в МЕУ за проверка дали отговаря на изискванията за оперативна съвместимост, информационна сигурност, архитектура, преизползване на общите компоненти (eID, ССЕВ, RegiX, pay.egov.bg, Държавен облак) и недопускане на дублиране на функционалност. За обединяването ИСС ⇄ FVMS това е gate преди поръчка/договор — именно тук се проверяват най-рисковите точки (дублиране между проекти 0026 и 0007, оперативна съвместимост, сигурност и хостинг на данните на Wialon).</w:t>
+        <w:t>В рамките на този контрол съществува отделна, задължителна стъпка — услугата „Проверка за съответствие на техническата спецификация". Преди администрацията да обяви обществена поръчка или да сключи договор за ИКТ дейност, тя внася техническата спецификация в МЕУ за проверка дали отговаря на изискванията за оперативна съвместимост, информационна сигурност, архитектура, преизползване на общите компоненти (eID, ССЕВ, RegiX, pay.egov.bg, Държавен облак) и недопускане на дублиране на функционалност. За обединяването ИСС ⇄ FVMS това е gate преди поръчка/договор.</w:t>
       </w:r>
     </w:p>
     <w:tbl>
@@ -517,7 +496,7 @@
           </w:tcPr>
           <w:p>
             <w:r>
-              <w:t>ЗЕУ — правомощия на МЕУ (бюджетен контрол по чл. 7д); порталът budget-project-control</w:t>
+              <w:t>ЗЕУ; порталът budget-project-control</w:t>
             </w:r>
           </w:p>
         </w:tc>
@@ -527,7 +506,7 @@
           </w:tcPr>
           <w:p>
             <w:r>
-              <w:t>Нов ИКТ проект → задължително внасяне за съгласуване в МЕУ преди разход</w:t>
+              <w:t>Нов ИКТ проект → внасяне за съгласуване в МЕУ преди разход</w:t>
             </w:r>
           </w:p>
         </w:tc>
@@ -549,7 +528,7 @@
           </w:tcPr>
           <w:p>
             <w:r>
-              <w:t>МЕУ услуга verification-compliance-technical-specifications</w:t>
+              <w:t>МЕУ услуга verification-compliance-technical-specifications; чл. 38 ЗЕУ</w:t>
             </w:r>
           </w:p>
         </w:tc>
@@ -559,7 +538,39 @@
           </w:tcPr>
           <w:p>
             <w:r>
-              <w:t>Техническата спецификация на интеграцията (API ИСС ⇄ FVMS) се внася за проверка преди обявяване на обществена поръчка/сключване на договор</w:t>
+              <w:t>ТС на интеграцията (API ИСС ⇄ FVMS) се внася за проверка преди поръчка/договор</w:t>
+            </w:r>
+          </w:p>
+        </w:tc>
+      </w:tr>
+      <w:tr>
+        <w:tc>
+          <w:tcPr>
+            <w:tcW w:type="dxa" w:w="2880"/>
+          </w:tcPr>
+          <w:p>
+            <w:r>
+              <w:t>Удостоверяване на съответствие на системата</w:t>
+            </w:r>
+          </w:p>
+        </w:tc>
+        <w:tc>
+          <w:tcPr>
+            <w:tcW w:type="dxa" w:w="2880"/>
+          </w:tcPr>
+          <w:p>
+            <w:r>
+              <w:t>чл. 58б от ЗЕУ</w:t>
+            </w:r>
+          </w:p>
+        </w:tc>
+        <w:tc>
+          <w:tcPr>
+            <w:tcW w:type="dxa" w:w="2880"/>
+          </w:tcPr>
+          <w:p>
+            <w:r>
+              <w:t>Удостоверяване на съответствие на съответен етап</w:t>
             </w:r>
           </w:p>
         </w:tc>
@@ -581,7 +592,7 @@
           </w:tcPr>
           <w:p>
             <w:r>
-              <w:t>НОИИСРЕАУ + регистрите за оперативна съвместимост на МЕУ</w:t>
+              <w:t>НОИИСРЕАУ + регистрите за оперативна съвместимост</w:t>
             </w:r>
           </w:p>
         </w:tc>
@@ -591,7 +602,7 @@
           </w:tcPr>
           <w:p>
             <w:r>
-              <w:t>Стандартизирани интерфейси за обмен; вписване в регистрите</w:t>
+              <w:t>Стандартизирани интерфейси; вписване в регистрите</w:t>
             </w:r>
           </w:p>
         </w:tc>
@@ -613,7 +624,7 @@
           </w:tcPr>
           <w:p>
             <w:r>
-              <w:t>ЗЕУ; RegiX / среда за междурегистров обмен</w:t>
+              <w:t>ЗЕУ; RegiX</w:t>
             </w:r>
           </w:p>
         </w:tc>
@@ -655,7 +666,7 @@
           </w:tcPr>
           <w:p>
             <w:r>
-              <w:t>ИСС вече ползва е-автентикация; FVMS-частта също да я покрие</w:t>
+              <w:t>ИСС вече ползва е-автентикация; FVMS-частта също</w:t>
             </w:r>
           </w:p>
         </w:tc>
@@ -709,7 +720,7 @@
           </w:tcPr>
           <w:p>
             <w:r>
-              <w:t>Политика на МЕУ за държавните системи</w:t>
+              <w:t>Политика на МЕУ</w:t>
             </w:r>
           </w:p>
         </w:tc>
@@ -719,7 +730,7 @@
           </w:tcPr>
           <w:p>
             <w:r>
-              <w:t>Критична точка за Wialon — виж раздел 4</w:t>
+              <w:t>Критична точка за Wialon — виж раздел 4 и 6</w:t>
             </w:r>
           </w:p>
         </w:tc>
@@ -741,7 +752,7 @@
           </w:tcPr>
           <w:p>
             <w:r>
-              <w:t>ЗКС + Наредба за мин. изисквания за МИС</w:t>
+              <w:t>ЗК + НМИМИС</w:t>
             </w:r>
           </w:p>
         </w:tc>
@@ -751,7 +762,7 @@
           </w:tcPr>
           <w:p>
             <w:r>
-              <w:t>Регистри на инциденти; контрол на достъп (Wialon има ACL модел)</w:t>
+              <w:t>Контрол на достъп (Wialon има ACL модел); журнали; сигурност by design</w:t>
             </w:r>
           </w:p>
         </w:tc>
@@ -773,7 +784,7 @@
           </w:tcPr>
           <w:p>
             <w:r>
-              <w:t>Регламент (ЕС) 2016/679 (GDPR); ЗЗЛД</w:t>
+              <w:t>GDPR; ЗЗЛД</w:t>
             </w:r>
           </w:p>
         </w:tc>
@@ -783,7 +794,7 @@
           </w:tcPr>
           <w:p>
             <w:r>
-              <w:t>Проследяване местоположението на инспектори → задължителна оценка на въздействието (DPIA)</w:t>
+              <w:t>GPS проследяване на инспектори → задължителна DPIA</w:t>
             </w:r>
           </w:p>
         </w:tc>
@@ -808,7 +819,7 @@
         <w:t xml:space="preserve">Различни проекти и изпълнители (0026 vs 0007). </w:t>
       </w:r>
       <w:r>
-        <w:t>Собствеността върху кода, лицензите и източникът на финансиране (ОПМДР) са различни. Обединяването е допустимо, но трябва да се уреди договорно/имуществено и да се съгласува с МЕУ, за да няма двойно финансиране на едни и същи функции.</w:t>
+        <w:t>Собственост върху кода, лицензи и финансиране (ОПМДР) са различни → уреждане договорно/имуществено и съгласуване с МЕУ, за да няма двойно финансиране.</w:t>
       </w:r>
     </w:p>
     <w:p>
@@ -822,7 +833,7 @@
         <w:t xml:space="preserve">Wialon Local е готов чужд продукт (Gurtam). </w:t>
       </w:r>
       <w:r>
-        <w:t>Чувствителни точки: локация и хостинг на данните (изискване за Държавен хибриден частен облак); достъп до изходен код / собственост; оперативна съвместимост със стандартите на МЕУ. Затова препоръката е интеграция през API, при която Wialon остава отделен компонент.</w:t>
+        <w:t>Чувствителни точки: локация/хостинг на данните (Държавен облак); собственост върху изходния код; оперативна съвместимост. Затова интеграция през API, при която Wialon остава отделен компонент.</w:t>
       </w:r>
     </w:p>
     <w:p>
@@ -836,7 +847,7 @@
         <w:t xml:space="preserve">GDPR за GPS проследяване на инспектори. </w:t>
       </w:r>
       <w:r>
-        <w:t>Задължителна оценка на въздействието (DPIA) и ясно правно основание (служебно/трудово правоотношение), при спазване на принципите за пропорционалност и ограничаване на целта.</w:t>
+        <w:t>Задължителна DPIA и ясно правно основание (служебно/трудово правоотношение), при пропорционалност и ограничаване на целта.</w:t>
       </w:r>
     </w:p>
     <w:p>
@@ -858,7 +869,7 @@
         <w:t xml:space="preserve">Технически — ДА. </w:t>
       </w:r>
       <w:r>
-        <w:t>Системите могат да се съвместят. Оптималният подход е интеграция ИСС ⇄ FVMS на ниво интерфейс (позиции на патрулните средства към модул „Контролна дейност"), а не сливане на кодовите бази.</w:t>
+        <w:t>Системите могат да се съвместят чрез интеграция ИСС ⇄ FVMS на ниво интерфейс, а не сливане на кодовите бази.</w:t>
       </w:r>
     </w:p>
     <w:p>
@@ -872,7 +883,7 @@
         <w:t xml:space="preserve">За съответствие с е-управление — ДА, но при условие, </w:t>
       </w:r>
       <w:r>
-        <w:t>че интеграцията се внесе за съгласуване в МЕУ през портала за бюджетен контрол и покрие: оперативна съвместимост, RegiX/служебно начало, е-идентификация, ССЕВ и плащания (pay.egov.bg), Държавен облак, мрежова и информационна сигурност и GDPR (DPIA).</w:t>
+        <w:t>че интеграцията се внесе за съгласуване в МЕУ, оформи се по образеца на ТС (Прил. № 1, чл. 38, ал. 3), премине проверката/удостоверяването по чл. 58б ЗЕУ и покрие оперативната съвместимост, RegiX, eID, ССЕВ/плащания, Държавния облак, сигурността и GDPR (DPIA).</w:t>
       </w:r>
     </w:p>
     <w:p>
@@ -885,9 +896,182 @@
         </w:rPr>
         <w:t xml:space="preserve">Порталът budget-project-control </w:t>
       </w:r>
-      <w:r/>
       <w:r>
-        <w:t>е формалната врата, през която обединяването става законосъобразно, а проверката за съответствие на техническата спецификация е конкретната задължителна стъпка преди обявяване на поръчка/сключване на договор.</w:t>
+        <w:t>е формалната врата, а проверката за съответствие на ТС — задължителната стъпка преди поръчка/договор.</w:t>
+      </w:r>
+    </w:p>
+    <w:p>
+      <w:pPr>
+        <w:pStyle w:val="ListBullet"/>
+      </w:pPr>
+      <w:r>
+        <w:rPr>
+          <w:b/>
+        </w:rPr>
+        <w:t xml:space="preserve">Решаващо ограничение (изходен код): </w:t>
+      </w:r>
+      <w:r>
+        <w:t>Wialon Local е затворен търговски продукт и не може да стане „собствен държавен софтуер с отворен код". Съответстващ модел: COTS-компонент (Wialon/FVMS) + собствен интеграционен слой с отворен код (раздел 6).</w:t>
+      </w:r>
+    </w:p>
+    <w:p>
+      <w:pPr>
+        <w:pStyle w:val="Heading1"/>
+      </w:pPr>
+      <w:r>
+        <w:t>6. Конкретни изисквания по методическата рамка на МЕУ (въз основа на предоставените образци)</w:t>
+      </w:r>
+    </w:p>
+    <w:p>
+      <w:pPr>
+        <w:pStyle w:val="Heading2"/>
+      </w:pPr>
+      <w:r>
+        <w:t>6.1. Задължителен образец на техническа спецификация</w:t>
+      </w:r>
+    </w:p>
+    <w:p>
+      <w:pPr>
+        <w:pStyle w:val="ListBullet"/>
+      </w:pPr>
+      <w:r>
+        <w:t>ТС се изготвя по образец Приложение № 1 към чл. 38, ал. 3 — задължителен за всички лица по чл. 1, ал. 1 и 2 от ЗЕУ; съдържанието не може да се изтрива, а само да се допълва.</w:t>
+      </w:r>
+    </w:p>
+    <w:p>
+      <w:pPr>
+        <w:pStyle w:val="ListBullet"/>
+      </w:pPr>
+      <w:r>
+        <w:t>Системата подлежи на удостоверяване на съответствие по чл. 58б от ЗЕУ.</w:t>
+      </w:r>
+    </w:p>
+    <w:p>
+      <w:pPr>
+        <w:pStyle w:val="ListBullet"/>
+      </w:pPr>
+      <w:r>
+        <w:t>Проектът се вписва в Регистъра на проектите и преминава проверка по Правилата за извършване на проверки на проектни предложения и дейности.</w:t>
+      </w:r>
+    </w:p>
+    <w:p>
+      <w:pPr>
+        <w:pStyle w:val="ListBullet"/>
+      </w:pPr>
+      <w:r>
+        <w:t>Нормативна рамка по образеца: ЗЕУ, ЗК, ЗЕИ, НОИИСРЕАУ, НМИМИС, Архитектура на електронното управление.</w:t>
+      </w:r>
+    </w:p>
+    <w:p>
+      <w:pPr>
+        <w:pStyle w:val="Heading2"/>
+      </w:pPr>
+      <w:r>
+        <w:t>6.2. Аргументация на прогнозната стойност</w:t>
+      </w:r>
+    </w:p>
+    <w:p>
+      <w:pPr>
+        <w:pStyle w:val="ListBullet"/>
+      </w:pPr>
+      <w:r>
+        <w:t>Време за изработване: 4–6 месеца при готова платформа; ≥ 6 месеца при изцяло нова разработка.</w:t>
+      </w:r>
+    </w:p>
+    <w:p>
+      <w:pPr>
+        <w:pStyle w:val="ListBullet"/>
+      </w:pPr>
+      <w:r>
+        <w:t>Разходи за поддръжка ≥ 15% от стойността на разработката/закупуването.</w:t>
+      </w:r>
+    </w:p>
+    <w:p>
+      <w:pPr>
+        <w:pStyle w:val="ListBullet"/>
+      </w:pPr>
+      <w:r>
+        <w:t>Решаващо дърво: „Приложимо ли е решението към повече от една администрация?" и „готов софтуер (COTS) vs. разработка на нов софтуер с право на собственост на изходния код".</w:t>
+      </w:r>
+    </w:p>
+    <w:p>
+      <w:pPr>
+        <w:pStyle w:val="Heading2"/>
+      </w:pPr>
+      <w:r>
+        <w:t>6.3. Изходен код и отворен код — най-съществената точка за ИСС ⇄ FVMS</w:t>
+      </w:r>
+    </w:p>
+    <w:p>
+      <w:r>
+        <w:t>НОИИСРЕАУ изисква за разработвания софтуер:</w:t>
+      </w:r>
+    </w:p>
+    <w:p>
+      <w:pPr>
+        <w:pStyle w:val="ListBullet"/>
+      </w:pPr>
+      <w:r>
+        <w:t>авторските права и изходният код да възникват за Възложителя (чл. 42 ЗАПСП), без ограничения;</w:t>
+      </w:r>
+    </w:p>
+    <w:p>
+      <w:pPr>
+        <w:pStyle w:val="ListBullet"/>
+      </w:pPr>
+      <w:r>
+        <w:t>допустими лицензи: GPL, LGPL, AGPL, Apache 2.0, New BSD, MIT, MPL 2.0, EUPL;</w:t>
+      </w:r>
+    </w:p>
+    <w:p>
+      <w:pPr>
+        <w:pStyle w:val="ListBullet"/>
+      </w:pPr>
+      <w:r>
+        <w:t>публично хранилище за изходен код (глава шеста, раздел IV от НОИИСРЕАУ), онлайн в реално време;</w:t>
+      </w:r>
+    </w:p>
+    <w:p>
+      <w:pPr>
+        <w:pStyle w:val="ListBullet"/>
+      </w:pPr>
+      <w:r>
+        <w:t>публична API документация (Swagger / API Blueprint / аналог) с примерен код (Java/.NET).</w:t>
+      </w:r>
+    </w:p>
+    <w:p>
+      <w:r>
+        <w:rPr>
+          <w:b/>
+        </w:rPr>
+        <w:t xml:space="preserve">Wialon Local е готов, затворен търговски продукт (Gurtam) и сам по себе си не отговаря на изискванията за собственост и отворен код. Нормативно съответстващият модел е: </w:t>
+      </w:r>
+      <w:r>
+        <w:t>Wialon / FVMS се третира като „готово софтуерно решение" (COTS) — лицензи + настройка; а интеграционният слой откъм ИСС (API адаптер) се разработва като собствен софтуер с отворен код по НОИИСРЕАУ. Готовата платформа остава отделен лицензиран компонент, а новата разработка е собственост на Възложителя, с отворен код, публично хранилище и документиран API.</w:t>
+      </w:r>
+    </w:p>
+    <w:p>
+      <w:pPr>
+        <w:pStyle w:val="Heading2"/>
+      </w:pPr>
+      <w:r>
+        <w:t>6.4. Допълнение към изводите</w:t>
+      </w:r>
+    </w:p>
+    <w:p>
+      <w:pPr>
+        <w:pStyle w:val="ListBullet"/>
+      </w:pPr>
+      <w:r>
+        <w:t>Обединяването е допустимо и съответства на е-управлението само ако е оформено по образеца на ТС (Прил. № 1, чл. 38, ал. 3), с аргументирана прогнозна стойност и преминава проверката/удостоверяването по чл. 58б ЗЕУ.</w:t>
+      </w:r>
+    </w:p>
+    <w:p>
+      <w:pPr>
+        <w:pStyle w:val="ListBullet"/>
+      </w:pPr>
+      <w:r>
+        <w:t>Чуждият COTS продукт (Wialon) не блокира обединяването, но определя архитектурата: лицензиран COTS-компонент + собствен интеграционен слой с отворен код.</w:t>
       </w:r>
     </w:p>
     <w:p>
@@ -902,7 +1086,7 @@
         <w:rPr>
           <w:i/>
         </w:rPr>
-        <w:t>живото съдържание на страницата egov.government.bg/.../budget-project-control не беше достъпно при изготвянето (мрежова политика блокира домейна egov.government.bg). Частта относно МЕУ и бюджетния контрол е изготвена въз основа на нормативната рамка (ЗЕУ и подзаконовите актове). Конкретните членове следва да се сверят с действащата редакция на ЗЕУ преди официално позоваване.</w:t>
+        <w:t>становището ползва (1) четирите ръководства на ИАРА (проекти 0026 и 0007) и (2) предоставените официални образци и правила на МЕУ за ПП и ТС (Приложение № 1 към чл. 38, ал. 3; Приложение № 2 към чл. 38, ал. 4; Правила за проверки на проектни предложения; образци за аргументация на прогнозна стойност). Самите портални страници на egov.government.bg не бяха достъпни директно (мрежова политика блокира домейна), затова процедурните детайли се основават на тези образци и на нормативната рамка. Конкретните членове следва да се сверят с действащите редакции на ЗЕУ и НОИИСРЕАУ преди официално позоваване.</w:t>
       </w:r>
     </w:p>
     <w:sectPr>

</xml_diff>

<commit_message>
Update становище: data-landscape map (one platform) & demarcation
Add section 7 (IARA data inventory → confirms М ИСС/PostgreSQL on ДХЧО is the
single platform for own data; what consolidates vs integrates) and section 8
(demarcation vs in-execution projects 0004/0005/0007/0008 to avoid double
financing of the new recreational-catch module). Updated source note to cover
the new inputs (задание v08012026, 1.001 conditions, projects list, data map).

https://claude.ai/code/session_01Q74gPyp6529zVVwBUZsh4d
</commit_message>
<xml_diff>
--- a/docs/stanovishte-IARA-ISS-FVMS-integraciya.docx
+++ b/docs/stanovishte-IARA-ISS-FVMS-integraciya.docx
@@ -41,7 +41,7 @@
         <w:t xml:space="preserve">Дата: </w:t>
       </w:r>
       <w:r>
-        <w:t>30.05.2026 г.</w:t>
+        <w:t>31.05.2026 г.</w:t>
       </w:r>
     </w:p>
     <w:p>
@@ -52,7 +52,7 @@
         <w:t xml:space="preserve">Предмет: </w:t>
       </w:r>
       <w:r>
-        <w:t>Анализ дали Информационно-статистическата система (ИСС) на ИАРА заедно с мобилните приложения за граждани и за инспектори могат да бъдат съвместени със Системата за сателитно наблюдение на инспекторски автомобили (СНРК 2.0 / FVMS 2.0), и дали такова обединяване отговаря на изискванията на Закона за електронното управление (ЗЕУ) и подзаконовата нормативна уредба.</w:t>
+        <w:t>Анализ дали ИСС на ИАРА заедно с мобилните приложения за граждани и за инспектори могат да бъдат съвместени със Системата за сателитно наблюдение (СНРК 2.0 / FVMS 2.0), възможна ли е една обща платформа/база данни, и съответства ли това на изискванията на електронното управление (ЗЕУ и подзаконовата уредба), вкл. избягване на двойно финансиране.</w:t>
       </w:r>
     </w:p>
     <w:p>
@@ -125,7 +125,7 @@
               <w:rPr>
                 <w:b/>
               </w:rPr>
-              <w:t>Проект (ОПМДР)</w:t>
+              <w:t>Проект (ОПМДР/ПМДРА)</w:t>
             </w:r>
           </w:p>
         </w:tc>
@@ -264,7 +264,7 @@
           </w:tcPr>
           <w:p>
             <w:r>
-              <w:t>Информационно-статистическа система (ИСС)</w:t>
+              <w:t>Информационно-статистическа система (М ИСС)</w:t>
             </w:r>
           </w:p>
         </w:tc>
@@ -274,7 +274,7 @@
           </w:tcPr>
           <w:p>
             <w:r>
-              <w:t>Централна бекенд система — регистри, заявления, контролна дейност</w:t>
+              <w:t>Централна бекенд система</w:t>
             </w:r>
           </w:p>
         </w:tc>
@@ -294,7 +294,7 @@
           </w:tcPr>
           <w:p>
             <w:r>
-              <w:t>проект 0026</w:t>
+              <w:t>ТехноЛогика ЕАД</w:t>
             </w:r>
           </w:p>
         </w:tc>
@@ -316,7 +316,7 @@
           </w:tcPr>
           <w:p>
             <w:r>
-              <w:t>СНРК 2.0 / FVMS 2.0 (платформа Wialon Local)</w:t>
+              <w:t>СНРК 2.0 / FVMS 2.0 (Wialon Local)</w:t>
             </w:r>
           </w:p>
         </w:tc>
@@ -326,7 +326,7 @@
           </w:tcPr>
           <w:p>
             <w:r>
-              <w:t>GPS/телеметрично проследяване и електронно докладване</w:t>
+              <w:t>GPS/телеметрично проследяване</w:t>
             </w:r>
           </w:p>
         </w:tc>
@@ -361,7 +361,7 @@
         <w:t xml:space="preserve">Ключово наблюдение: </w:t>
       </w:r>
       <w:r>
-        <w:t>документи 1–3 са една и съща интегрирана екосистема (проект 0026): ИСС е централната система (модули „Административни услуги", „Контролна дейност", „Администрация" с номенклатури „Инспектори" и „Патрулни средства" и др.), а двете мобилни приложения са нейни канали за достъп. Документ 4 (СНРК 2.0 / FVMS) е отделен продукт от друг проект (0007), на друг изпълнител (Скортел ООД), базиран на готовата търговска платформа Wialon Local.</w:t>
+        <w:t>документи 1–3 са една интегрирана екосистема (проект 0026); документ 4 е отделен COTS продукт (Wialon) от проект 0007.</w:t>
       </w:r>
     </w:p>
     <w:p>
@@ -382,7 +382,7 @@
     </w:p>
     <w:p>
       <w:r>
-        <w:t>ИСС и двете мобилни приложения споделят потребители, номенклатури и бизнес процеси и са проектирани да работят заедно.</w:t>
+        <w:t>ИСС и двете мобилни приложения споделят потребители, номенклатури и процеси.</w:t>
       </w:r>
     </w:p>
     <w:p>
@@ -390,12 +390,7 @@
         <w:pStyle w:val="Heading2"/>
       </w:pPr>
       <w:r>
-        <w:t>2.2. Документ 4 (FVMS / Wialon) — съвместим чрез интеграция</w:t>
-      </w:r>
-    </w:p>
-    <w:p>
-      <w:r>
-        <w:t>Естествена точка на интеграция: ИСС/инспекторското приложение оперират с „инспектори" и „патрулни средства", а FVMS/Wialon знае реалното им местоположение и телеметрия.</w:t>
+        <w:t>2.2. Документ 4 (FVMS/Wialon) — съвместим чрез интеграция</w:t>
       </w:r>
     </w:p>
     <w:p>
@@ -403,10 +398,10 @@
         <w:rPr>
           <w:b/>
         </w:rPr>
-        <w:t xml:space="preserve">Препоръчителен модел: интеграция през интерфейс (API), а не сливане на кодовите бази. </w:t>
+        <w:t xml:space="preserve">Препоръчителен модел: интеграция през API, а не сливане на кодовите бази. </w:t>
       </w:r>
       <w:r>
-        <w:t>FVMS/Wialon подава позиции и телеметрия → ИСС ги съхранява/визуализира към съответната инспекция и патрулно средство.</w:t>
+        <w:t>FVMS подава позиции/телеметрия → ИСС ги съхранява към съответната инспекция.</w:t>
       </w:r>
     </w:p>
     <w:p>
@@ -414,17 +409,12 @@
         <w:pStyle w:val="Heading1"/>
       </w:pPr>
       <w:r>
-        <w:t>3. Отговаря ли обединяването на изискванията на електронното управление? — ДА, при условия</w:t>
+        <w:t>3. Съответствие с изискванията на електронното управление — ДА, при условия</w:t>
       </w:r>
     </w:p>
     <w:p>
       <w:r>
-        <w:t>Връзката към портала на Министерството на електронното управление (МЕУ) — budget-project-control — сочи към механизма за съгласуване и бюджетен контрол на ИКТ проектите на администрациите.</w:t>
-      </w:r>
-    </w:p>
-    <w:p>
-      <w:r>
-        <w:t>В рамките на този контрол съществува отделна, задължителна стъпка — услугата „Проверка за съответствие на техническата спецификация". Преди администрацията да обяви обществена поръчка или да сключи договор за ИКТ дейност, тя внася техническата спецификация в МЕУ за проверка дали отговаря на изискванията за оперативна съвместимост, информационна сигурност, архитектура, преизползване на общите компоненти (eID, ССЕВ, RegiX, pay.egov.bg, Държавен облак) и недопускане на дублиране на функционалност. За обединяването ИСС ⇄ FVMS това е gate преди поръчка/договор.</w:t>
+        <w:t>Порталът на МЕУ budget-project-control е механизмът за съгласуване/бюджетен контрол; услугата „Проверка за съответствие на техническата спецификация" е gate преди поръчка/договор.</w:t>
       </w:r>
     </w:p>
     <w:tbl>
@@ -486,7 +476,7 @@
           </w:tcPr>
           <w:p>
             <w:r>
-              <w:t>Съгласуване / бюджетен контрол на ИКТ проекта</w:t>
+              <w:t>Съгласуване/бюджетен контрол</w:t>
             </w:r>
           </w:p>
         </w:tc>
@@ -496,7 +486,7 @@
           </w:tcPr>
           <w:p>
             <w:r>
-              <w:t>ЗЕУ; порталът budget-project-control</w:t>
+              <w:t>ЗЕУ; budget-project-control</w:t>
             </w:r>
           </w:p>
         </w:tc>
@@ -506,7 +496,7 @@
           </w:tcPr>
           <w:p>
             <w:r>
-              <w:t>Нов ИКТ проект → внасяне за съгласуване в МЕУ преди разход</w:t>
+              <w:t>Внасяне за съгласуване в МЕУ преди разход</w:t>
             </w:r>
           </w:p>
         </w:tc>
@@ -518,7 +508,7 @@
           </w:tcPr>
           <w:p>
             <w:r>
-              <w:t>Проверка за съответствие на техническата спецификация</w:t>
+              <w:t>Проверка за съответствие на ТС</w:t>
             </w:r>
           </w:p>
         </w:tc>
@@ -528,7 +518,7 @@
           </w:tcPr>
           <w:p>
             <w:r>
-              <w:t>МЕУ услуга verification-compliance-technical-specifications; чл. 38 ЗЕУ</w:t>
+              <w:t>чл. 38 ЗЕУ; услуга на МЕУ</w:t>
             </w:r>
           </w:p>
         </w:tc>
@@ -538,7 +528,7 @@
           </w:tcPr>
           <w:p>
             <w:r>
-              <w:t>ТС на интеграцията (API ИСС ⇄ FVMS) се внася за проверка преди поръчка/договор</w:t>
+              <w:t>ТС се проверява преди поръчка/договор</w:t>
             </w:r>
           </w:p>
         </w:tc>
@@ -550,7 +540,7 @@
           </w:tcPr>
           <w:p>
             <w:r>
-              <w:t>Удостоверяване на съответствие на системата</w:t>
+              <w:t>Удостоверяване на съответствие</w:t>
             </w:r>
           </w:p>
         </w:tc>
@@ -560,7 +550,7 @@
           </w:tcPr>
           <w:p>
             <w:r>
-              <w:t>чл. 58б от ЗЕУ</w:t>
+              <w:t>чл. 58б ЗЕУ</w:t>
             </w:r>
           </w:p>
         </w:tc>
@@ -570,7 +560,7 @@
           </w:tcPr>
           <w:p>
             <w:r>
-              <w:t>Удостоверяване на съответствие на съответен етап</w:t>
+              <w:t>На съответен етап</w:t>
             </w:r>
           </w:p>
         </w:tc>
@@ -592,7 +582,7 @@
           </w:tcPr>
           <w:p>
             <w:r>
-              <w:t>НОИИСРЕАУ + регистрите за оперативна съвместимост</w:t>
+              <w:t>НОИИСРЕАУ; регистри</w:t>
             </w:r>
           </w:p>
         </w:tc>
@@ -602,7 +592,7 @@
           </w:tcPr>
           <w:p>
             <w:r>
-              <w:t>Стандартизирани интерфейси; вписване в регистрите</w:t>
+              <w:t>Стандартизирани API; вписване</w:t>
             </w:r>
           </w:p>
         </w:tc>
@@ -614,7 +604,7 @@
           </w:tcPr>
           <w:p>
             <w:r>
-              <w:t>Еднократно събиране на данни / служебно начало</w:t>
+              <w:t>Еднократност / служебно начало</w:t>
             </w:r>
           </w:p>
         </w:tc>
@@ -634,7 +624,7 @@
           </w:tcPr>
           <w:p>
             <w:r>
-              <w:t>Без дублиране на данни между ИСС и FVMS</w:t>
+              <w:t>Без дублиране на чужди данни</w:t>
             </w:r>
           </w:p>
         </w:tc>
@@ -646,7 +636,7 @@
           </w:tcPr>
           <w:p>
             <w:r>
-              <w:t>Електронна идентификация и автентикация</w:t>
+              <w:t>Е-идентификация</w:t>
             </w:r>
           </w:p>
         </w:tc>
@@ -656,7 +646,7 @@
           </w:tcPr>
           <w:p>
             <w:r>
-              <w:t>ЗЕИ / eID; egov.bg</w:t>
+              <w:t>ЗЕИ/eID</w:t>
             </w:r>
           </w:p>
         </w:tc>
@@ -666,7 +656,7 @@
           </w:tcPr>
           <w:p>
             <w:r>
-              <w:t>ИСС вече ползва е-автентикация; FVMS-частта също</w:t>
+              <w:t>ИСС вече ползва</w:t>
             </w:r>
           </w:p>
         </w:tc>
@@ -678,7 +668,7 @@
           </w:tcPr>
           <w:p>
             <w:r>
-              <w:t>Сигурно е-връчване и електронно плащане</w:t>
+              <w:t>Сигурно връчване / плащане</w:t>
             </w:r>
           </w:p>
         </w:tc>
@@ -688,7 +678,7 @@
           </w:tcPr>
           <w:p>
             <w:r>
-              <w:t>ССЕВ; ПЕП / pay.egov.bg</w:t>
+              <w:t>ССЕВ; pay.egov.bg</w:t>
             </w:r>
           </w:p>
         </w:tc>
@@ -698,7 +688,7 @@
           </w:tcPr>
           <w:p>
             <w:r>
-              <w:t>Гражданското приложение вече ползва pay.egov.bg</w:t>
+              <w:t>Вече ползвани</w:t>
             </w:r>
           </w:p>
         </w:tc>
@@ -710,7 +700,7 @@
           </w:tcPr>
           <w:p>
             <w:r>
-              <w:t>Хостинг в Държавния хибриден частен облак</w:t>
+              <w:t>Държавен облак (ДХЧО)</w:t>
             </w:r>
           </w:p>
         </w:tc>
@@ -720,7 +710,7 @@
           </w:tcPr>
           <w:p>
             <w:r>
-              <w:t>Политика на МЕУ</w:t>
+              <w:t>политика на МЕУ</w:t>
             </w:r>
           </w:p>
         </w:tc>
@@ -730,7 +720,7 @@
           </w:tcPr>
           <w:p>
             <w:r>
-              <w:t>Критична точка за Wialon — виж раздел 4 и 6</w:t>
+              <w:t>ИСС вече е на ДХЧО; Wialon — на собствен комплекс</w:t>
             </w:r>
           </w:p>
         </w:tc>
@@ -752,7 +742,7 @@
           </w:tcPr>
           <w:p>
             <w:r>
-              <w:t>ЗК + НМИМИС</w:t>
+              <w:t>ЗК; НМИМИС</w:t>
             </w:r>
           </w:p>
         </w:tc>
@@ -762,7 +752,7 @@
           </w:tcPr>
           <w:p>
             <w:r>
-              <w:t>Контрол на достъп (Wialon има ACL модел); журнали; сигурност by design</w:t>
+              <w:t>Оценка на риска; журнали</w:t>
             </w:r>
           </w:p>
         </w:tc>
@@ -774,7 +764,7 @@
           </w:tcPr>
           <w:p>
             <w:r>
-              <w:t>Защита на личните данни</w:t>
+              <w:t>Лични данни</w:t>
             </w:r>
           </w:p>
         </w:tc>
@@ -794,7 +784,7 @@
           </w:tcPr>
           <w:p>
             <w:r>
-              <w:t>GPS проследяване на инспектори → задължителна DPIA</w:t>
+              <w:t>DPIA за GPS проследяване</w:t>
             </w:r>
           </w:p>
         </w:tc>
@@ -816,10 +806,10 @@
         <w:rPr>
           <w:b/>
         </w:rPr>
-        <w:t xml:space="preserve">Различни проекти и изпълнители (0026 vs 0007). </w:t>
+        <w:t xml:space="preserve">Различни проекти/изпълнители (0026 vs 0007). </w:t>
       </w:r>
       <w:r>
-        <w:t>Собственост върху кода, лицензи и финансиране (ОПМДР) са различни → уреждане договорно/имуществено и съгласуване с МЕУ, за да няма двойно финансиране.</w:t>
+        <w:t>Уреждане договорно/имуществено; без двойно финансиране.</w:t>
       </w:r>
     </w:p>
     <w:p>
@@ -833,7 +823,7 @@
         <w:t xml:space="preserve">Wialon Local е готов чужд продукт (Gurtam). </w:t>
       </w:r>
       <w:r>
-        <w:t>Чувствителни точки: локация/хостинг на данните (Държавен облак); собственост върху изходния код; оперативна съвместимост. Затова интеграция през API, при която Wialon остава отделен компонент.</w:t>
+        <w:t>Локация на данните; собственост на кода; оперативна съвместимост → интеграция през API.</w:t>
       </w:r>
     </w:p>
     <w:p>
@@ -844,10 +834,10 @@
         <w:rPr>
           <w:b/>
         </w:rPr>
-        <w:t xml:space="preserve">GDPR за GPS проследяване на инспектори. </w:t>
+        <w:t xml:space="preserve">GDPR за GPS проследяване. </w:t>
       </w:r>
       <w:r>
-        <w:t>Задължителна DPIA и ясно правно основание (служебно/трудово правоотношение), при пропорционалност и ограничаване на целта.</w:t>
+        <w:t>Задължителна DPIA и ясно правно основание.</w:t>
       </w:r>
     </w:p>
     <w:p>
@@ -869,7 +859,7 @@
         <w:t xml:space="preserve">Технически — ДА. </w:t>
       </w:r>
       <w:r>
-        <w:t>Системите могат да се съвместят чрез интеграция ИСС ⇄ FVMS на ниво интерфейс, а не сливане на кодовите бази.</w:t>
+        <w:t>Интеграция ИСС ⇄ FVMS на ниво интерфейс, не сливане на кодове.</w:t>
       </w:r>
     </w:p>
     <w:p>
@@ -880,10 +870,10 @@
         <w:rPr>
           <w:b/>
         </w:rPr>
-        <w:t xml:space="preserve">За съответствие с е-управление — ДА, но при условие, </w:t>
+        <w:t xml:space="preserve">За е-управление — ДА, при условие, </w:t>
       </w:r>
       <w:r>
-        <w:t>че интеграцията се внесе за съгласуване в МЕУ, оформи се по образеца на ТС (Прил. № 1, чл. 38, ал. 3), премине проверката/удостоверяването по чл. 58б ЗЕУ и покрие оперативната съвместимост, RegiX, eID, ССЕВ/плащания, Държавния облак, сигурността и GDPR (DPIA).</w:t>
+        <w:t>съгласуване в МЕУ, ТС по образец (чл. 38, ал. 3), проверка/удостоверяване по чл. 58б ЗЕУ, оперативна съвместимост, RegiX, eID, ССЕВ/плащания, ДХЧО, сигурност, GDPR.</w:t>
       </w:r>
     </w:p>
     <w:p>
@@ -894,10 +884,10 @@
         <w:rPr>
           <w:b/>
         </w:rPr>
-        <w:t xml:space="preserve">Порталът budget-project-control </w:t>
+        <w:t xml:space="preserve">Изходен код: </w:t>
       </w:r>
       <w:r>
-        <w:t>е формалната врата, а проверката за съответствие на ТС — задължителната стъпка преди поръчка/договор.</w:t>
+        <w:t>Wialon (затворен COTS) не може да стане собствен OSS → COTS компонент + собствен интеграционен слой с отворен код.</w:t>
       </w:r>
     </w:p>
     <w:p>
@@ -908,10 +898,10 @@
         <w:rPr>
           <w:b/>
         </w:rPr>
-        <w:t xml:space="preserve">Решаващо ограничение (изходен код): </w:t>
+        <w:t xml:space="preserve">Една платформа: </w:t>
       </w:r>
       <w:r>
-        <w:t>Wialon Local е затворен търговски продукт и не може да стане „собствен държавен софтуер с отворен код". Съответстващ модел: COTS-компонент (Wialon/FVMS) + собствен интеграционен слой с отворен код (раздел 6).</w:t>
+        <w:t>М ИСС вече е единната база/платформа за собствените данни — новите нужди стават модули в нея; останалите системи се интегрират (раздел 7).</w:t>
       </w:r>
     </w:p>
     <w:p>
@@ -919,15 +909,7 @@
         <w:pStyle w:val="Heading1"/>
       </w:pPr>
       <w:r>
-        <w:t>6. Конкретни изисквания по методическата рамка на МЕУ (въз основа на предоставените образци)</w:t>
-      </w:r>
-    </w:p>
-    <w:p>
-      <w:pPr>
-        <w:pStyle w:val="Heading2"/>
-      </w:pPr>
-      <w:r>
-        <w:t>6.1. Задължителен образец на техническа спецификация</w:t>
+        <w:t>6. Конкретни изисквания по методическата рамка на МЕУ (образци ПП и ТС)</w:t>
       </w:r>
     </w:p>
     <w:p>
@@ -935,7 +917,7 @@
         <w:pStyle w:val="ListBullet"/>
       </w:pPr>
       <w:r>
-        <w:t>ТС се изготвя по образец Приложение № 1 към чл. 38, ал. 3 — задължителен за всички лица по чл. 1, ал. 1 и 2 от ЗЕУ; съдържанието не може да се изтрива, а само да се допълва.</w:t>
+        <w:t>ТС по образец Приложение № 1 към чл. 38, ал. 3 — задължителен; съдържанието не се изтрива.</w:t>
       </w:r>
     </w:p>
     <w:p>
@@ -943,7 +925,7 @@
         <w:pStyle w:val="ListBullet"/>
       </w:pPr>
       <w:r>
-        <w:t>Системата подлежи на удостоверяване на съответствие по чл. 58б от ЗЕУ.</w:t>
+        <w:t>Удостоверяване на съответствие по чл. 58б ЗЕУ; вписване в Регистъра на проектите.</w:t>
       </w:r>
     </w:p>
     <w:p>
@@ -951,7 +933,7 @@
         <w:pStyle w:val="ListBullet"/>
       </w:pPr>
       <w:r>
-        <w:t>Проектът се вписва в Регистъра на проектите и преминава проверка по Правилата за извършване на проверки на проектни предложения и дейности.</w:t>
+        <w:t>Аргументация на прогнозната стойност (4–6 мес. готова платформа; ≥6 мес. нова разработка; поддръжка ≥15%).</w:t>
       </w:r>
     </w:p>
     <w:p>
@@ -959,15 +941,646 @@
         <w:pStyle w:val="ListBullet"/>
       </w:pPr>
       <w:r>
-        <w:t>Нормативна рамка по образеца: ЗЕУ, ЗК, ЗЕИ, НОИИСРЕАУ, НМИМИС, Архитектура на електронното управление.</w:t>
+        <w:t>НОИИСРЕАУ: изходен код за Възложителя (чл. 42 ЗАПСП); отворени лицензи (GPL/EUPL и др.); публично хранилище; публична API документация.</w:t>
+      </w:r>
+    </w:p>
+    <w:p>
+      <w:r>
+        <w:rPr>
+          <w:b/>
+        </w:rPr>
+        <w:t xml:space="preserve">Wialon Local е затворен COTS продукт и не отговаря на изискването за собствен отворен код. </w:t>
+      </w:r>
+      <w:r>
+        <w:t>Съответстващ модел: Wialon = готово лицензирано решение (COTS); интеграционният слой от ИСС = собствен софтуер с отворен код.</w:t>
       </w:r>
     </w:p>
     <w:p>
       <w:pPr>
-        <w:pStyle w:val="Heading2"/>
+        <w:pStyle w:val="Heading1"/>
       </w:pPr>
       <w:r>
-        <w:t>6.2. Аргументация на прогнозната стойност</w:t>
+        <w:t>7. Карта на данните и единна платформа (на база „Описание на данните на ИАРА")</w:t>
+      </w:r>
+    </w:p>
+    <w:p>
+      <w:r>
+        <w:t>Описанието на данните потвърждава, че ядрото на собствените данни на ИАРА вече е консолидирано в една платформа — М ИСС (PostgreSQL, ДХЧО, поддръжка по проект 1.001-0008).</w:t>
+      </w:r>
+    </w:p>
+    <w:tbl>
+      <w:tblPr>
+        <w:tblStyle w:val="LightGrid-Accent1"/>
+        <w:tblW w:type="auto" w:w="0"/>
+        <w:tblLook w:firstColumn="1" w:firstRow="1" w:lastColumn="0" w:lastRow="0" w:noHBand="0" w:noVBand="1" w:val="04A0"/>
+      </w:tblPr>
+      <w:tblGrid>
+        <w:gridCol w:w="1728"/>
+        <w:gridCol w:w="1728"/>
+        <w:gridCol w:w="1728"/>
+        <w:gridCol w:w="1728"/>
+        <w:gridCol w:w="1728"/>
+      </w:tblGrid>
+      <w:tr>
+        <w:tc>
+          <w:tcPr>
+            <w:tcW w:type="dxa" w:w="1728"/>
+          </w:tcPr>
+          <w:p>
+            <w:r>
+              <w:rPr>
+                <w:b/>
+              </w:rPr>
+              <w:t>Данни</w:t>
+            </w:r>
+          </w:p>
+        </w:tc>
+        <w:tc>
+          <w:tcPr>
+            <w:tcW w:type="dxa" w:w="1728"/>
+          </w:tcPr>
+          <w:p>
+            <w:r>
+              <w:rPr>
+                <w:b/>
+              </w:rPr>
+              <w:t>Система/платформа</w:t>
+            </w:r>
+          </w:p>
+        </w:tc>
+        <w:tc>
+          <w:tcPr>
+            <w:tcW w:type="dxa" w:w="1728"/>
+          </w:tcPr>
+          <w:p>
+            <w:r>
+              <w:rPr>
+                <w:b/>
+              </w:rPr>
+              <w:t>Хостинг</w:t>
+            </w:r>
+          </w:p>
+        </w:tc>
+        <w:tc>
+          <w:tcPr>
+            <w:tcW w:type="dxa" w:w="1728"/>
+          </w:tcPr>
+          <w:p>
+            <w:r>
+              <w:rPr>
+                <w:b/>
+              </w:rPr>
+              <w:t>Финансиране</w:t>
+            </w:r>
+          </w:p>
+        </w:tc>
+        <w:tc>
+          <w:tcPr>
+            <w:tcW w:type="dxa" w:w="1728"/>
+          </w:tcPr>
+          <w:p>
+            <w:r>
+              <w:rPr>
+                <w:b/>
+              </w:rPr>
+              <w:t>Консолидация</w:t>
+            </w:r>
+          </w:p>
+        </w:tc>
+      </w:tr>
+      <w:tr>
+        <w:tc>
+          <w:tcPr>
+            <w:tcW w:type="dxa" w:w="1728"/>
+          </w:tcPr>
+          <w:p>
+            <w:r>
+              <w:t>Регистър на флота (CFR)</w:t>
+            </w:r>
+          </w:p>
+        </w:tc>
+        <w:tc>
+          <w:tcPr>
+            <w:tcW w:type="dxa" w:w="1728"/>
+          </w:tcPr>
+          <w:p>
+            <w:r>
+              <w:t>М ИСС</w:t>
+            </w:r>
+          </w:p>
+        </w:tc>
+        <w:tc>
+          <w:tcPr>
+            <w:tcW w:type="dxa" w:w="1728"/>
+          </w:tcPr>
+          <w:p>
+            <w:r>
+              <w:t>ДХЧО</w:t>
+            </w:r>
+          </w:p>
+        </w:tc>
+        <w:tc>
+          <w:tcPr>
+            <w:tcW w:type="dxa" w:w="1728"/>
+          </w:tcPr>
+          <w:p>
+            <w:r>
+              <w:t>0008</w:t>
+            </w:r>
+          </w:p>
+        </w:tc>
+        <w:tc>
+          <w:tcPr>
+            <w:tcW w:type="dxa" w:w="1728"/>
+          </w:tcPr>
+          <w:p>
+            <w:r>
+              <w:t>✅ в ИСС</w:t>
+            </w:r>
+          </w:p>
+        </w:tc>
+      </w:tr>
+      <w:tr>
+        <w:tc>
+          <w:tcPr>
+            <w:tcW w:type="dxa" w:w="1728"/>
+          </w:tcPr>
+          <w:p>
+            <w:r>
+              <w:t>ERS дневници (FLUX)</w:t>
+            </w:r>
+          </w:p>
+        </w:tc>
+        <w:tc>
+          <w:tcPr>
+            <w:tcW w:type="dxa" w:w="1728"/>
+          </w:tcPr>
+          <w:p>
+            <w:r>
+              <w:t>М ИСС</w:t>
+            </w:r>
+          </w:p>
+        </w:tc>
+        <w:tc>
+          <w:tcPr>
+            <w:tcW w:type="dxa" w:w="1728"/>
+          </w:tcPr>
+          <w:p>
+            <w:r>
+              <w:t>ДХЧО</w:t>
+            </w:r>
+          </w:p>
+        </w:tc>
+        <w:tc>
+          <w:tcPr>
+            <w:tcW w:type="dxa" w:w="1728"/>
+          </w:tcPr>
+          <w:p>
+            <w:r>
+              <w:t>0008; → 0007</w:t>
+            </w:r>
+          </w:p>
+        </w:tc>
+        <w:tc>
+          <w:tcPr>
+            <w:tcW w:type="dxa" w:w="1728"/>
+          </w:tcPr>
+          <w:p>
+            <w:r>
+              <w:t>✅ в ИСС</w:t>
+            </w:r>
+          </w:p>
+        </w:tc>
+      </w:tr>
+      <w:tr>
+        <w:tc>
+          <w:tcPr>
+            <w:tcW w:type="dxa" w:w="1728"/>
+          </w:tcPr>
+          <w:p>
+            <w:r>
+              <w:t>Регистри по ЗРА (билети, разрешителни, аквакултури, купувачи, рибари)</w:t>
+            </w:r>
+          </w:p>
+        </w:tc>
+        <w:tc>
+          <w:tcPr>
+            <w:tcW w:type="dxa" w:w="1728"/>
+          </w:tcPr>
+          <w:p>
+            <w:r>
+              <w:t>М ИСС</w:t>
+            </w:r>
+          </w:p>
+        </w:tc>
+        <w:tc>
+          <w:tcPr>
+            <w:tcW w:type="dxa" w:w="1728"/>
+          </w:tcPr>
+          <w:p>
+            <w:r>
+              <w:t>ДХЧО</w:t>
+            </w:r>
+          </w:p>
+        </w:tc>
+        <w:tc>
+          <w:tcPr>
+            <w:tcW w:type="dxa" w:w="1728"/>
+          </w:tcPr>
+          <w:p>
+            <w:r>
+              <w:t>0008</w:t>
+            </w:r>
+          </w:p>
+        </w:tc>
+        <w:tc>
+          <w:tcPr>
+            <w:tcW w:type="dxa" w:w="1728"/>
+          </w:tcPr>
+          <w:p>
+            <w:r>
+              <w:t>✅ в ИСС — тук влиза любителският улов</w:t>
+            </w:r>
+          </w:p>
+        </w:tc>
+      </w:tr>
+      <w:tr>
+        <w:tc>
+          <w:tcPr>
+            <w:tcW w:type="dxa" w:w="1728"/>
+          </w:tcPr>
+          <w:p>
+            <w:r>
+              <w:t>Квоти / ОДУ</w:t>
+            </w:r>
+          </w:p>
+        </w:tc>
+        <w:tc>
+          <w:tcPr>
+            <w:tcW w:type="dxa" w:w="1728"/>
+          </w:tcPr>
+          <w:p>
+            <w:r>
+              <w:t>М ИСС</w:t>
+            </w:r>
+          </w:p>
+        </w:tc>
+        <w:tc>
+          <w:tcPr>
+            <w:tcW w:type="dxa" w:w="1728"/>
+          </w:tcPr>
+          <w:p>
+            <w:r>
+              <w:t>ДХЧО</w:t>
+            </w:r>
+          </w:p>
+        </w:tc>
+        <w:tc>
+          <w:tcPr>
+            <w:tcW w:type="dxa" w:w="1728"/>
+          </w:tcPr>
+          <w:p>
+            <w:r>
+              <w:t>0008</w:t>
+            </w:r>
+          </w:p>
+        </w:tc>
+        <w:tc>
+          <w:tcPr>
+            <w:tcW w:type="dxa" w:w="1728"/>
+          </w:tcPr>
+          <w:p>
+            <w:r>
+              <w:t>✅ в ИСС</w:t>
+            </w:r>
+          </w:p>
+        </w:tc>
+      </w:tr>
+      <w:tr>
+        <w:tc>
+          <w:tcPr>
+            <w:tcW w:type="dxa" w:w="1728"/>
+          </w:tcPr>
+          <w:p>
+            <w:r>
+              <w:t>Публично уеб съдържание</w:t>
+            </w:r>
+          </w:p>
+        </w:tc>
+        <w:tc>
+          <w:tcPr>
+            <w:tcW w:type="dxa" w:w="1728"/>
+          </w:tcPr>
+          <w:p>
+            <w:r>
+              <w:t>публичен модул на ИСС</w:t>
+            </w:r>
+          </w:p>
+        </w:tc>
+        <w:tc>
+          <w:tcPr>
+            <w:tcW w:type="dxa" w:w="1728"/>
+          </w:tcPr>
+          <w:p>
+            <w:r>
+              <w:t>ДХЧО</w:t>
+            </w:r>
+          </w:p>
+        </w:tc>
+        <w:tc>
+          <w:tcPr>
+            <w:tcW w:type="dxa" w:w="1728"/>
+          </w:tcPr>
+          <w:p>
+            <w:r>
+              <w:t>0008</w:t>
+            </w:r>
+          </w:p>
+        </w:tc>
+        <w:tc>
+          <w:tcPr>
+            <w:tcW w:type="dxa" w:w="1728"/>
+          </w:tcPr>
+          <w:p>
+            <w:r>
+              <w:t>✅ в ИСС</w:t>
+            </w:r>
+          </w:p>
+        </w:tc>
+      </w:tr>
+      <w:tr>
+        <w:tc>
+          <w:tcPr>
+            <w:tcW w:type="dxa" w:w="1728"/>
+          </w:tcPr>
+          <w:p>
+            <w:r>
+              <w:t>VMS сателитни позиции</w:t>
+            </w:r>
+          </w:p>
+        </w:tc>
+        <w:tc>
+          <w:tcPr>
+            <w:tcW w:type="dxa" w:w="1728"/>
+          </w:tcPr>
+          <w:p>
+            <w:r>
+              <w:t>СНРК 2.0 / Wialon</w:t>
+            </w:r>
+          </w:p>
+        </w:tc>
+        <w:tc>
+          <w:tcPr>
+            <w:tcW w:type="dxa" w:w="1728"/>
+          </w:tcPr>
+          <w:p>
+            <w:r>
+              <w:t>собствен сървър</w:t>
+            </w:r>
+          </w:p>
+        </w:tc>
+        <w:tc>
+          <w:tcPr>
+            <w:tcW w:type="dxa" w:w="1728"/>
+          </w:tcPr>
+          <w:p>
+            <w:r>
+              <w:t>0007/0008</w:t>
+            </w:r>
+          </w:p>
+        </w:tc>
+        <w:tc>
+          <w:tcPr>
+            <w:tcW w:type="dxa" w:w="1728"/>
+          </w:tcPr>
+          <w:p>
+            <w:r>
+              <w:t>⚠️ COTS → интеграция (FLUX)</w:t>
+            </w:r>
+          </w:p>
+        </w:tc>
+      </w:tr>
+      <w:tr>
+        <w:tc>
+          <w:tcPr>
+            <w:tcW w:type="dxa" w:w="1728"/>
+          </w:tcPr>
+          <w:p>
+            <w:r>
+              <w:t>Деловодство</w:t>
+            </w:r>
+          </w:p>
+        </w:tc>
+        <w:tc>
+          <w:tcPr>
+            <w:tcW w:type="dxa" w:w="1728"/>
+          </w:tcPr>
+          <w:p>
+            <w:r>
+              <w:t>Евентис (лицензна)</w:t>
+            </w:r>
+          </w:p>
+        </w:tc>
+        <w:tc>
+          <w:tcPr>
+            <w:tcW w:type="dxa" w:w="1728"/>
+          </w:tcPr>
+          <w:p>
+            <w:r>
+              <w:t>доставчик</w:t>
+            </w:r>
+          </w:p>
+        </w:tc>
+        <w:tc>
+          <w:tcPr>
+            <w:tcW w:type="dxa" w:w="1728"/>
+          </w:tcPr>
+          <w:p>
+            <w:r>
+              <w:t>—</w:t>
+            </w:r>
+          </w:p>
+        </w:tc>
+        <w:tc>
+          <w:tcPr>
+            <w:tcW w:type="dxa" w:w="1728"/>
+          </w:tcPr>
+          <w:p>
+            <w:r>
+              <w:t>⚠️ интеграция (СЕОС)</w:t>
+            </w:r>
+          </w:p>
+        </w:tc>
+      </w:tr>
+      <w:tr>
+        <w:tc>
+          <w:tcPr>
+            <w:tcW w:type="dxa" w:w="1728"/>
+          </w:tcPr>
+          <w:p>
+            <w:r>
+              <w:t>Счетоводство + ПРБ</w:t>
+            </w:r>
+          </w:p>
+        </w:tc>
+        <w:tc>
+          <w:tcPr>
+            <w:tcW w:type="dxa" w:w="1728"/>
+          </w:tcPr>
+          <w:p>
+            <w:r>
+              <w:t>счет. софтуер + модул ПРБ</w:t>
+            </w:r>
+          </w:p>
+        </w:tc>
+        <w:tc>
+          <w:tcPr>
+            <w:tcW w:type="dxa" w:w="1728"/>
+          </w:tcPr>
+          <w:p>
+            <w:r>
+              <w:t>собствен + ДХЧО</w:t>
+            </w:r>
+          </w:p>
+        </w:tc>
+        <w:tc>
+          <w:tcPr>
+            <w:tcW w:type="dxa" w:w="1728"/>
+          </w:tcPr>
+          <w:p>
+            <w:r>
+              <w:t>ПРБ = 0004</w:t>
+            </w:r>
+          </w:p>
+        </w:tc>
+        <w:tc>
+          <w:tcPr>
+            <w:tcW w:type="dxa" w:w="1728"/>
+          </w:tcPr>
+          <w:p>
+            <w:r>
+              <w:t>🟡 ПРБ се влива в ИСС</w:t>
+            </w:r>
+          </w:p>
+        </w:tc>
+      </w:tr>
+      <w:tr>
+        <w:tc>
+          <w:tcPr>
+            <w:tcW w:type="dxa" w:w="1728"/>
+          </w:tcPr>
+          <w:p>
+            <w:r>
+              <w:t>Научни данни (DCF)</w:t>
+            </w:r>
+          </w:p>
+        </w:tc>
+        <w:tc>
+          <w:tcPr>
+            <w:tcW w:type="dxa" w:w="1728"/>
+          </w:tcPr>
+          <w:p>
+            <w:r>
+              <w:t>dcf-bulgaria.bg + институти</w:t>
+            </w:r>
+          </w:p>
+        </w:tc>
+        <w:tc>
+          <w:tcPr>
+            <w:tcW w:type="dxa" w:w="1728"/>
+          </w:tcPr>
+          <w:p>
+            <w:r>
+              <w:t>собствен + изпълнители</w:t>
+            </w:r>
+          </w:p>
+        </w:tc>
+        <w:tc>
+          <w:tcPr>
+            <w:tcW w:type="dxa" w:w="1728"/>
+          </w:tcPr>
+          <w:p>
+            <w:r>
+              <w:t>1.002.0002</w:t>
+            </w:r>
+          </w:p>
+        </w:tc>
+        <w:tc>
+          <w:tcPr>
+            <w:tcW w:type="dxa" w:w="1728"/>
+          </w:tcPr>
+          <w:p>
+            <w:r>
+              <w:t>⚠️ отделна платформа</w:t>
+            </w:r>
+          </w:p>
+        </w:tc>
+      </w:tr>
+      <w:tr>
+        <w:tc>
+          <w:tcPr>
+            <w:tcW w:type="dxa" w:w="1728"/>
+          </w:tcPr>
+          <w:p>
+            <w:r>
+              <w:t>IUU уловни сертификати</w:t>
+            </w:r>
+          </w:p>
+        </w:tc>
+        <w:tc>
+          <w:tcPr>
+            <w:tcW w:type="dxa" w:w="1728"/>
+          </w:tcPr>
+          <w:p>
+            <w:r>
+              <w:t>CATCH (на ЕК)</w:t>
+            </w:r>
+          </w:p>
+        </w:tc>
+        <w:tc>
+          <w:tcPr>
+            <w:tcW w:type="dxa" w:w="1728"/>
+          </w:tcPr>
+          <w:p>
+            <w:r>
+              <w:t>ЕК</w:t>
+            </w:r>
+          </w:p>
+        </w:tc>
+        <w:tc>
+          <w:tcPr>
+            <w:tcW w:type="dxa" w:w="1728"/>
+          </w:tcPr>
+          <w:p>
+            <w:r>
+              <w:t>—</w:t>
+            </w:r>
+          </w:p>
+        </w:tc>
+        <w:tc>
+          <w:tcPr>
+            <w:tcW w:type="dxa" w:w="1728"/>
+          </w:tcPr>
+          <w:p>
+            <w:r>
+              <w:t>⛔ външна → интеграция</w:t>
+            </w:r>
+          </w:p>
+        </w:tc>
+      </w:tr>
+    </w:tbl>
+    <w:p>
+      <w:pPr>
+        <w:pStyle w:val="ListBullet"/>
+      </w:pPr>
+      <w:r>
+        <w:rPr>
+          <w:b/>
+        </w:rPr>
+        <w:t xml:space="preserve">Една платформа вече съществува (М ИСС). </w:t>
+      </w:r>
+      <w:r>
+        <w:t>Скъпите „прехвърляния" идват от системите извън нея.</w:t>
       </w:r>
     </w:p>
     <w:p>
@@ -975,7 +1588,13 @@
         <w:pStyle w:val="ListBullet"/>
       </w:pPr>
       <w:r>
-        <w:t>Време за изработване: 4–6 месеца при готова платформа; ≥ 6 месеца при изцяло нова разработка.</w:t>
+        <w:rPr>
+          <w:b/>
+        </w:rPr>
+        <w:t xml:space="preserve">Критерий за консолидация: </w:t>
+      </w:r>
+      <w:r>
+        <w:t>собствени данни, на които ИАРА е първичен администратор → модул в М ИСС (билети, улови, разрешителни, квоти, ПРБ); останалите → интеграция, не сливане.</w:t>
       </w:r>
     </w:p>
     <w:p>
@@ -983,7 +1602,244 @@
         <w:pStyle w:val="ListBullet"/>
       </w:pPr>
       <w:r>
-        <w:t>Разходи за поддръжка ≥ 15% от стойността на разработката/закупуването.</w:t>
+        <w:rPr>
+          <w:b/>
+        </w:rPr>
+        <w:t xml:space="preserve">Принцип за еднократност: </w:t>
+      </w:r>
+      <w:r>
+        <w:t>чужди данни (CATCH/ЕК, регистри през RegiX) не се дублират.</w:t>
+      </w:r>
+    </w:p>
+    <w:p>
+      <w:pPr>
+        <w:pStyle w:val="Heading1"/>
+      </w:pPr>
+      <w:r>
+        <w:t>8. Демаркация и риск от двойно финансиране</w:t>
+      </w:r>
+    </w:p>
+    <w:p>
+      <w:r>
+        <w:t>Текущи проекти по процедура BG14MFPR001-1.001 „Контрол и правоприлагане", които създават риск от застъпване:</w:t>
+      </w:r>
+    </w:p>
+    <w:tbl>
+      <w:tblPr>
+        <w:tblStyle w:val="LightGrid-Accent1"/>
+        <w:tblW w:type="auto" w:w="0"/>
+        <w:tblLook w:firstColumn="1" w:firstRow="1" w:lastColumn="0" w:lastRow="0" w:noHBand="0" w:noVBand="1" w:val="04A0"/>
+      </w:tblPr>
+      <w:tblGrid>
+        <w:gridCol w:w="2880"/>
+        <w:gridCol w:w="2880"/>
+        <w:gridCol w:w="2880"/>
+      </w:tblGrid>
+      <w:tr>
+        <w:tc>
+          <w:tcPr>
+            <w:tcW w:type="dxa" w:w="2880"/>
+          </w:tcPr>
+          <w:p>
+            <w:r>
+              <w:rPr>
+                <w:b/>
+              </w:rPr>
+              <w:t>Проект (статус)</w:t>
+            </w:r>
+          </w:p>
+        </w:tc>
+        <w:tc>
+          <w:tcPr>
+            <w:tcW w:type="dxa" w:w="2880"/>
+          </w:tcPr>
+          <w:p>
+            <w:r>
+              <w:rPr>
+                <w:b/>
+              </w:rPr>
+              <w:t>Предмет</w:t>
+            </w:r>
+          </w:p>
+        </w:tc>
+        <w:tc>
+          <w:tcPr>
+            <w:tcW w:type="dxa" w:w="2880"/>
+          </w:tcPr>
+          <w:p>
+            <w:r>
+              <w:rPr>
+                <w:b/>
+              </w:rPr>
+              <w:t>Застъпване</w:t>
+            </w:r>
+          </w:p>
+        </w:tc>
+      </w:tr>
+      <w:tr>
+        <w:tc>
+          <w:tcPr>
+            <w:tcW w:type="dxa" w:w="2880"/>
+          </w:tcPr>
+          <w:p>
+            <w:r>
+              <w:t>1.001-0004 (в изпълнение)</w:t>
+            </w:r>
+          </w:p>
+        </w:tc>
+        <w:tc>
+          <w:tcPr>
+            <w:tcW w:type="dxa" w:w="2880"/>
+          </w:tcPr>
+          <w:p>
+            <w:r>
+              <w:t>Модул „ПРБ" към ИСС</w:t>
+            </w:r>
+          </w:p>
+        </w:tc>
+        <w:tc>
+          <w:tcPr>
+            <w:tcW w:type="dxa" w:w="2880"/>
+          </w:tcPr>
+          <w:p>
+            <w:r>
+              <w:t>шаблон „модул към ИСС"; друг домейн</w:t>
+            </w:r>
+          </w:p>
+        </w:tc>
+      </w:tr>
+      <w:tr>
+        <w:tc>
+          <w:tcPr>
+            <w:tcW w:type="dxa" w:w="2880"/>
+          </w:tcPr>
+          <w:p>
+            <w:r>
+              <w:t>1.001-0005 (в изпълнение)</w:t>
+            </w:r>
+          </w:p>
+        </w:tc>
+        <w:tc>
+          <w:tcPr>
+            <w:tcW w:type="dxa" w:w="2880"/>
+          </w:tcPr>
+          <w:p>
+            <w:r>
+              <w:t>Надграждане на системите за наблюдение + ИСС</w:t>
+            </w:r>
+          </w:p>
+        </w:tc>
+        <w:tc>
+          <w:tcPr>
+            <w:tcW w:type="dxa" w:w="2880"/>
+          </w:tcPr>
+          <w:p>
+            <w:r>
+              <w:t>общо „надграждане на ИСС"</w:t>
+            </w:r>
+          </w:p>
+        </w:tc>
+      </w:tr>
+      <w:tr>
+        <w:tc>
+          <w:tcPr>
+            <w:tcW w:type="dxa" w:w="2880"/>
+          </w:tcPr>
+          <w:p>
+            <w:r>
+              <w:t>1.001-0007 (в изпълнение)</w:t>
+            </w:r>
+          </w:p>
+        </w:tc>
+        <w:tc>
+          <w:tcPr>
+            <w:tcW w:type="dxa" w:w="2880"/>
+          </w:tcPr>
+          <w:p>
+            <w:r>
+              <w:t>Бордово оборудване 9–11.99 м + интеграция СНРК и М ИСС</w:t>
+            </w:r>
+          </w:p>
+        </w:tc>
+        <w:tc>
+          <w:tcPr>
+            <w:tcW w:type="dxa" w:w="2880"/>
+          </w:tcPr>
+          <w:p>
+            <w:r>
+              <w:t>интеграция ИСС ⇄ СНРК</w:t>
+            </w:r>
+          </w:p>
+        </w:tc>
+      </w:tr>
+      <w:tr>
+        <w:tc>
+          <w:tcPr>
+            <w:tcW w:type="dxa" w:w="2880"/>
+          </w:tcPr>
+          <w:p>
+            <w:r>
+              <w:t>1.001-0008 (в изпълнение)</w:t>
+            </w:r>
+          </w:p>
+        </w:tc>
+        <w:tc>
+          <w:tcPr>
+            <w:tcW w:type="dxa" w:w="2880"/>
+          </w:tcPr>
+          <w:p>
+            <w:r>
+              <w:t>Функциониране на СНРК + FLUX + ИСС</w:t>
+            </w:r>
+          </w:p>
+        </w:tc>
+        <w:tc>
+          <w:tcPr>
+            <w:tcW w:type="dxa" w:w="2880"/>
+          </w:tcPr>
+          <w:p>
+            <w:r>
+              <w:t>поддръжка/функционалност на ИСС</w:t>
+            </w:r>
+          </w:p>
+        </w:tc>
+      </w:tr>
+      <w:tr>
+        <w:tc>
+          <w:tcPr>
+            <w:tcW w:type="dxa" w:w="2880"/>
+          </w:tcPr>
+          <w:p>
+            <w:r>
+              <w:t>3.001-0026 (приключен)</w:t>
+            </w:r>
+          </w:p>
+        </w:tc>
+        <w:tc>
+          <w:tcPr>
+            <w:tcW w:type="dxa" w:w="2880"/>
+          </w:tcPr>
+          <w:p>
+            <w:r>
+              <w:t>Надграждане на ИСС + мобилни приложения + ЕАУ</w:t>
+            </w:r>
+          </w:p>
+        </w:tc>
+        <w:tc>
+          <w:tcPr>
+            <w:tcW w:type="dxa" w:w="2880"/>
+          </w:tcPr>
+          <w:p>
+            <w:r>
+              <w:t>първоначална разработка на мобилното приложение</w:t>
+            </w:r>
+          </w:p>
+        </w:tc>
+      </w:tr>
+    </w:tbl>
+    <w:p>
+      <w:r>
+        <w:t>Демаркация за новото задание (любителски улов), за да е допустимо (т. 14.2, т. 1; чл. 188 Регл. 2018/1046):</w:t>
       </w:r>
     </w:p>
     <w:p>
@@ -991,20 +1847,7 @@
         <w:pStyle w:val="ListBullet"/>
       </w:pPr>
       <w:r>
-        <w:t>Решаващо дърво: „Приложимо ли е решението към повече от една администрация?" и „готов софтуер (COTS) vs. разработка на нов софтуер с право на собственост на изходния код".</w:t>
-      </w:r>
-    </w:p>
-    <w:p>
-      <w:pPr>
-        <w:pStyle w:val="Heading2"/>
-      </w:pPr>
-      <w:r>
-        <w:t>6.3. Изходен код и отворен код — най-съществената точка за ИСС ⇄ FVMS</w:t>
-      </w:r>
-    </w:p>
-    <w:p>
-      <w:r>
-        <w:t>НОИИСРЕАУ изисква за разработвания софтуер:</w:t>
+        <w:t>надгражда ИСС само за домейна „улов от любителски риболов / лицензионен режим / дигитален билет / RecFishing";</w:t>
       </w:r>
     </w:p>
     <w:p>
@@ -1012,7 +1855,7 @@
         <w:pStyle w:val="ListBullet"/>
       </w:pPr>
       <w:r>
-        <w:t>авторските права и изходният код да възникват за Възложителя (чл. 42 ЗАПСП), без ограничения;</w:t>
+        <w:t>не дублира общата поддръжка (0008), модул ПРБ (0004), нито VMS разширението (0007);</w:t>
       </w:r>
     </w:p>
     <w:p>
@@ -1020,7 +1863,7 @@
         <w:pStyle w:val="ListBullet"/>
       </w:pPr>
       <w:r>
-        <w:t>допустими лицензи: GPL, LGPL, AGPL, Apache 2.0, New BSD, MIT, MPL 2.0, EUPL;</w:t>
+        <w:t>мобилно приложение: миграцията Xamarin → поддържана платформа е нов разход (EOL от 01.05.2024 г.), не повторно финансиране на 0026;</w:t>
       </w:r>
     </w:p>
     <w:p>
@@ -1028,7 +1871,7 @@
         <w:pStyle w:val="ListBullet"/>
       </w:pPr>
       <w:r>
-        <w:t>публично хранилище за изходен код (глава шеста, раздел IV от НОИИСРЕАУ), онлайн в реално време;</w:t>
+        <w:t>интеграция със СНРК: преизползване на вече изградената (0007/0008), без повторна разработка;</w:t>
       </w:r>
     </w:p>
     <w:p>
@@ -1036,42 +1879,7 @@
         <w:pStyle w:val="ListBullet"/>
       </w:pPr>
       <w:r>
-        <w:t>публична API документация (Swagger / API Blueprint / аналог) с примерен код (Java/.NET).</w:t>
-      </w:r>
-    </w:p>
-    <w:p>
-      <w:r>
-        <w:rPr>
-          <w:b/>
-        </w:rPr>
-        <w:t xml:space="preserve">Wialon Local е готов, затворен търговски продукт (Gurtam) и сам по себе си не отговаря на изискванията за собственост и отворен код. Нормативно съответстващият модел е: </w:t>
-      </w:r>
-      <w:r>
-        <w:t>Wialon / FVMS се третира като „готово софтуерно решение" (COTS) — лицензи + настройка; а интеграционният слой откъм ИСС (API адаптер) се разработва като собствен софтуер с отворен код по НОИИСРЕАУ. Готовата платформа остава отделен лицензиран компонент, а новата разработка е собственост на Възложителя, с отворен код, публично хранилище и документиран API.</w:t>
-      </w:r>
-    </w:p>
-    <w:p>
-      <w:pPr>
-        <w:pStyle w:val="Heading2"/>
-      </w:pPr>
-      <w:r>
-        <w:t>6.4. Допълнение към изводите</w:t>
-      </w:r>
-    </w:p>
-    <w:p>
-      <w:pPr>
-        <w:pStyle w:val="ListBullet"/>
-      </w:pPr>
-      <w:r>
-        <w:t>Обединяването е допустимо и съответства на е-управлението само ако е оформено по образеца на ТС (Прил. № 1, чл. 38, ал. 3), с аргументирана прогнозна стойност и преминава проверката/удостоверяването по чл. 58б ЗЕУ.</w:t>
-      </w:r>
-    </w:p>
-    <w:p>
-      <w:pPr>
-        <w:pStyle w:val="ListBullet"/>
-      </w:pPr>
-      <w:r>
-        <w:t>Чуждият COTS продукт (Wialon) не блокира обединяването, но определя архитектурата: лицензиран COTS-компонент + собствен интеграционен слой с отворен код.</w:t>
+        <w:t>към формуляра в ИСУН: декларация за липса на двойно финансиране + демаркационна таблица.</w:t>
       </w:r>
     </w:p>
     <w:p>
@@ -1086,7 +1894,7 @@
         <w:rPr>
           <w:i/>
         </w:rPr>
-        <w:t>становището ползва (1) четирите ръководства на ИАРА (проекти 0026 и 0007) и (2) предоставените официални образци и правила на МЕУ за ПП и ТС (Приложение № 1 към чл. 38, ал. 3; Приложение № 2 към чл. 38, ал. 4; Правила за проверки на проектни предложения; образци за аргументация на прогнозна стойност). Самите портални страници на egov.government.bg не бяха достъпни директно (мрежова политика блокира домейна), затова процедурните детайли се основават на тези образци и на нормативната рамка. Конкретните членове следва да се сверят с действащите редакции на ЗЕУ и НОИИСРЕАУ преди официално позоваване.</w:t>
+        <w:t>становището ползва четирите ръководства на ИАРА (0026, 0007); образците и правилата на МЕУ за ПП и ТС; заданието за модул „Любителски улов" (v08012026); Условията по процедура BG14MFPR001-1.001; списъка с проекти; и описанието на данните на ИАРА. Страниците на egov.government.bg не бяха достъпни директно (мрежова политика). Конкретните членове и проектни обхвати да се сверят с действащите ЗЕУ/НОИИСРЕАУ и актуалните договори преди официално позоваване.</w:t>
       </w:r>
     </w:p>
     <w:sectPr>

</xml_diff>